<commit_message>
Prepare Startup Operational Excellence review packet
</commit_message>
<xml_diff>
--- a/output/doc/Startup Operational Excellence-Chapter 1 expanded Sam draft.docx
+++ b/output/doc/Startup Operational Excellence-Chapter 1 expanded Sam draft.docx
@@ -32,7 +32,7 @@
           <w:b w:val="0"/>
           <w:sz w:val="22"/>
         </w:rPr>
-        <w:t>by Robert McCarthy</w:t>
+        <w:t>by Robert T. McCarthy</w:t>
       </w:r>
     </w:p>
     <w:p>
@@ -76,7 +76,7 @@
           </w:p>
           <w:p>
             <w:r>
-              <w:t>The founder scenes in this chapter use Sam as a composite character. They are designed to teach practical lessons without exposing private client details. This draft was developed with AI-assisted drafting under Robert McCarthy's direction; the voice, judgment, final decisions, and responsibility remain with the author.</w:t>
+              <w:t>The founder scenes in this chapter use Sam as a composite character. They are designed to teach practical lessons without exposing private client details. This draft was developed with AI-assisted drafting under Robert T. McCarthy's direction; the voice, judgment, final decisions, and responsibility remain with the author.</w:t>
             </w:r>
           </w:p>
         </w:tc>

</xml_diff>